<commit_message>
CV update(2026-03-12), also vscode configs
</commit_message>
<xml_diff>
--- a/assets/CV.docx
+++ b/assets/CV.docx
@@ -16,7 +16,13 @@
       </w:r>
       <w:r>
         <w:br/>
-        <w:t>Termez, Uzbekistan | ligvadogamer@email.com | github.com/Asuzaka</w:t>
+        <w:t>Term</w:t>
+      </w:r>
+      <w:r>
+        <w:t>i</w:t>
+      </w:r>
+      <w:r>
+        <w:t>z, Uzbekistan | ligvadogamer@email.com | github.com/Asuzaka</w:t>
       </w:r>
     </w:p>
     <w:p>
@@ -29,7 +35,7 @@
     </w:p>
     <w:p>
       <w:r>
-        <w:t>Full-Stack Web Developer with hands-on experience in React, Next.js, Node.js, and TypeScript, combined with real-world experience in deploying and supporting production systems. Strong background in modern frontend architecture (FSD), backend authentication systems, and end-to-end application delivery.</w:t>
+        <w:t>Full-Stack Web Developer with hands-on experience in React, Next.js, Node.js, and TypeScript, combined with real-world experience in deploying and supporting production systems. Strong background in modern frontend architecture, backend authentication systems, and end-to-end application delivery.</w:t>
       </w:r>
     </w:p>
     <w:p>
@@ -42,23 +48,83 @@
     </w:p>
     <w:p>
       <w:r>
-        <w:t>Languages: JavaScript, TypeScript, Go, HTML, CSS</w:t>
+        <w:t>Languages: JavaScript, TypeScript, Go</w:t>
+      </w:r>
+      <w:r>
+        <w:t>.</w:t>
       </w:r>
       <w:r>
         <w:br/>
-        <w:t>Frameworks &amp; Libraries: React, Next.js, Redux Toolkit, Zustand, React Hook Form, TanStack Query, Tailwind CSS, Hero UI, i18next, Zod, React Router, NestJS</w:t>
+        <w:t>Frameworks &amp; Libraries: React, Next.js,</w:t>
+      </w:r>
+      <w:r>
+        <w:t xml:space="preserve"> </w:t>
+      </w:r>
+      <w:r>
+        <w:t>CMS,</w:t>
+      </w:r>
+      <w:r>
+        <w:t xml:space="preserve"> Redux, Zustand, Tailwind CSS, i18n,</w:t>
+      </w:r>
+      <w:r>
+        <w:t xml:space="preserve"> TSQ, UI libs</w:t>
+      </w:r>
+      <w:r>
+        <w:t>,</w:t>
+      </w:r>
+      <w:r>
+        <w:t xml:space="preserve"> Graphql basics, R</w:t>
+      </w:r>
+      <w:r>
+        <w:t>EST.</w:t>
+      </w:r>
+      <w:r>
+        <w:t xml:space="preserve"> </w:t>
       </w:r>
       <w:r>
         <w:br/>
-        <w:t>Backend &amp; Databases: Node.js, Express, MongoDB, PostgreSQL, Prisma, TypeORM, Supabase</w:t>
+        <w:t>Backend &amp; Databases: Node.js</w:t>
+      </w:r>
+      <w:r>
+        <w:t xml:space="preserve"> </w:t>
+      </w:r>
+      <w:r>
+        <w:t>Nest</w:t>
+      </w:r>
+      <w:r>
+        <w:t>.js</w:t>
+      </w:r>
+      <w:r>
+        <w:t>, Express, MongoDB, PostgreSQL, Prisma, TypeORM</w:t>
+      </w:r>
+      <w:r>
+        <w:t>.</w:t>
       </w:r>
       <w:r>
         <w:br/>
         <w:t>Tools: Git, Postman, Netlify, Railway, Heroku, Vercel</w:t>
       </w:r>
       <w:r>
+        <w:t>,</w:t>
+      </w:r>
+      <w:r>
+        <w:t xml:space="preserve"> Swagger</w:t>
+      </w:r>
+      <w:r>
+        <w:t xml:space="preserve">, </w:t>
+      </w:r>
+      <w:r>
+        <w:t>Supabase</w:t>
+      </w:r>
+      <w:r>
+        <w:t>.</w:t>
+      </w:r>
+      <w:r>
         <w:br/>
-        <w:t>Architecture &amp; Methodologies: Feature-Sliced Design (FSD), MVC, BEM, CI/CD basics</w:t>
+        <w:t>Architecture &amp; Methodologies: FSD, MVC, BEM, CI/CD</w:t>
+      </w:r>
+      <w:r>
+        <w:t>.</w:t>
       </w:r>
     </w:p>
     <w:p>
@@ -68,6 +134,12 @@
       <w:r>
         <w:t>Experience</w:t>
       </w:r>
+      <w:r>
+        <w:t xml:space="preserve"> (</w:t>
+      </w:r>
+      <w:r>
+        <w:t>overall - 8 months)</w:t>
+      </w:r>
     </w:p>
     <w:p>
       <w:r>
@@ -89,10 +161,6 @@
         <w:br/>
         <w:t>- Implemented UI components and feature improvements using React and Next.js.</w:t>
       </w:r>
-      <w:r>
-        <w:br/>
-        <w:t>- Participated in code reviews, task planning, and team communication.</w:t>
-      </w:r>
     </w:p>
     <w:p>
       <w:r>
@@ -128,7 +196,7 @@
         <w:t>Software Installer / IT Systems Technician — Alipos (Dec 2025 –</w:t>
       </w:r>
       <w:r>
-        <w:t xml:space="preserve"> January 2026</w:t>
+        <w:t xml:space="preserve"> Jan 2026</w:t>
       </w:r>
       <w:r>
         <w:t>)</w:t>
@@ -154,10 +222,10 @@
     </w:p>
     <w:p>
       <w:r>
-        <w:t xml:space="preserve">Frontend Developer Intern — SATashkent (Jan 2026 – </w:t>
-      </w:r>
-      <w:r>
-        <w:t>Present</w:t>
+        <w:t>Frontend Developer Intern — SATashkent (Jan 2026 –</w:t>
+      </w:r>
+      <w:r>
+        <w:t>March 2026</w:t>
       </w:r>
       <w:r>
         <w:t>)</w:t>
@@ -168,13 +236,13 @@
       </w:r>
       <w:r>
         <w:br/>
+        <w:t>- Collaborate with a frontend team on client-facing web applications.</w:t>
+      </w:r>
+      <w:r>
+        <w:br/>
       </w:r>
       <w:r>
         <w:lastRenderedPageBreak/>
-        <w:t>- Collaborate with a frontend team on client-facing web applications.</w:t>
-      </w:r>
-      <w:r>
-        <w:br/>
         <w:t>- Participate in daily calls, sprint discussions, and task planning.</w:t>
       </w:r>
       <w:r>
@@ -183,6 +251,76 @@
       <w:r>
         <w:br/>
         <w:t>- Use ClickUp for task tracking and Slack for team communication.</w:t>
+      </w:r>
+    </w:p>
+    <w:p>
+      <w:r>
+        <w:t>Frontend Developer</w:t>
+      </w:r>
+      <w:r>
+        <w:t xml:space="preserve"> </w:t>
+      </w:r>
+      <w:r>
+        <w:t xml:space="preserve">— </w:t>
+      </w:r>
+      <w:r>
+        <w:t xml:space="preserve">TUES </w:t>
+      </w:r>
+      <w:r>
+        <w:t>(</w:t>
+      </w:r>
+      <w:r>
+        <w:t>March 2026</w:t>
+      </w:r>
+      <w:r>
+        <w:t xml:space="preserve"> – </w:t>
+      </w:r>
+      <w:r>
+        <w:t>Present</w:t>
+      </w:r>
+      <w:r>
+        <w:t>)</w:t>
+      </w:r>
+      <w:r>
+        <w:br/>
+        <w:t>- Develop</w:t>
+      </w:r>
+      <w:r>
+        <w:t>ing projects with React and Next</w:t>
+      </w:r>
+      <w:r>
+        <w:t>.</w:t>
+      </w:r>
+      <w:r>
+        <w:t>js</w:t>
+      </w:r>
+      <w:r>
+        <w:t>.</w:t>
+      </w:r>
+      <w:r>
+        <w:br/>
+        <w:t xml:space="preserve">- Participate in </w:t>
+      </w:r>
+      <w:r>
+        <w:t>decision makings</w:t>
+      </w:r>
+      <w:r>
+        <w:t xml:space="preserve">, </w:t>
+      </w:r>
+      <w:r>
+        <w:t>deadlines</w:t>
+      </w:r>
+      <w:r>
+        <w:t xml:space="preserve">, and </w:t>
+      </w:r>
+      <w:r>
+        <w:t>architecture</w:t>
+      </w:r>
+      <w:r>
+        <w:t>.</w:t>
+      </w:r>
+      <w:r>
+        <w:t xml:space="preserve"> </w:t>
       </w:r>
     </w:p>
     <w:p>
@@ -457,7 +595,10 @@
       </w:r>
       <w:r>
         <w:br/>
-        <w:t>- Current active portfolio deployed on Vercel.</w:t>
+        <w:t>- Current active portfolio deployed on Vercel</w:t>
+      </w:r>
+      <w:r>
+        <w:t>.</w:t>
       </w:r>
       <w:r>
         <w:br/>
@@ -521,10 +662,13 @@
     </w:p>
     <w:p>
       <w:r>
-        <w:t>Uzbek (Native), Russian (C1), English (B2, IELTS 6.5)</w:t>
-      </w:r>
-      <w:r>
-        <w:tab/>
+        <w:t>Languages: Uzbek (Native), Russian (C1), English (B2, IELTS 6.5</w:t>
+      </w:r>
+      <w:r>
+        <w:t xml:space="preserve"> 2023</w:t>
+      </w:r>
+      <w:r>
+        <w:t>)</w:t>
       </w:r>
     </w:p>
     <w:sectPr>

</xml_diff>